<commit_message>
docs: embed high-level architecture diagram as PNG image in Word document
Generate a proper colored visual architecture diagram using Node.js canvas
showing Hub and Agent cluster zones, components, communication arrows with
ports/protocols, legend, and required ports summary. The PNG is embedded
directly in the Word document under section 4.

https://claude.ai/code/session_01F4JExjQdDmtQgo57VcSgGB
</commit_message>
<xml_diff>
--- a/docs/TCS-KubeNexus-AI-Multi-Cluster-Network-Architecture.docx
+++ b/docs/TCS-KubeNexus-AI-Multi-Cluster-Network-Architecture.docx
@@ -1910,1154 +1910,72 @@
           <w:sz w:val="22"/>
           <w:szCs w:val="22"/>
         </w:rPr>
-        <w:t xml:space="preserve">The following diagram shows the logical architecture with all components and communication paths.</w:t>
+        <w:t xml:space="preserve">The following diagram shows the high-level architecture with all components, communication paths, ports, and protocols.</w:t>
       </w:r>
     </w:p>
-    <w:tbl>
-      <w:tblPr>
-        <w:tblW w:type="pct" w:w="100%"/>
-        <w:tblBorders>
-          <w:top w:val="single" w:color="auto" w:sz="4"/>
-          <w:left w:val="single" w:color="auto" w:sz="4"/>
-          <w:bottom w:val="single" w:color="auto" w:sz="4"/>
-          <w:right w:val="single" w:color="auto" w:sz="4"/>
-          <w:insideH w:val="single" w:color="auto" w:sz="4"/>
-          <w:insideV w:val="single" w:color="auto" w:sz="4"/>
-        </w:tblBorders>
-      </w:tblPr>
-      <w:tblGrid>
-        <w:gridCol w:w="100"/>
-      </w:tblGrid>
-      <w:tr>
-        <w:tc>
-          <w:tcPr>
-            <w:tcBorders>
-              <w:top w:val="single" w:color="2563eb" w:sz="3"/>
-              <w:left w:val="single" w:color="2563eb" w:sz="3"/>
-              <w:bottom w:val="single" w:color="2563eb" w:sz="3"/>
-              <w:right w:val="single" w:color="2563eb" w:sz="3"/>
-            </w:tcBorders>
-            <w:shd w:fill="DBEAFE" w:val="clear"/>
-            <w:tcMar>
-              <w:top w:type="dxa" w:w="120"/>
-              <w:left w:type="dxa" w:w="160"/>
-              <w:bottom w:type="dxa" w:w="120"/>
-              <w:right w:type="dxa" w:w="160"/>
-            </w:tcMar>
-          </w:tcPr>
-          <w:p>
-            <w:pPr>
-              <w:spacing w:after="20"/>
-            </w:pPr>
-            <w:r>
-              <w:rPr>
-                <w:rFonts w:ascii="Calibri" w:cs="Calibri" w:eastAsia="Calibri" w:hAnsi="Calibri"/>
-                <w:b/>
-                <w:bCs/>
-                <w:color w:val="1e3a5f"/>
-                <w:sz w:val="24"/>
-                <w:szCs w:val="24"/>
-              </w:rPr>
-              <w:t xml:space="preserve">☁  SNO HUB CLUSTER</w:t>
-            </w:r>
-          </w:p>
-          <w:p>
-            <w:pPr>
-              <w:spacing w:after="40"/>
-            </w:pPr>
-            <w:r>
-              <w:rPr>
-                <w:rFonts w:ascii="Calibri" w:cs="Calibri" w:eastAsia="Calibri" w:hAnsi="Calibri"/>
-                <w:i/>
-                <w:iCs/>
-                <w:color w:val="6B7280"/>
-                <w:sz w:val="18"/>
-                <w:szCs w:val="18"/>
-              </w:rPr>
-              <w:t xml:space="preserve">10.131.71.72 — Namespace: openshift-mcp</w:t>
-            </w:r>
-          </w:p>
-          <w:p>
-            <w:pPr>
-              <w:spacing w:after="20"/>
-            </w:pPr>
-            <w:r>
-              <w:rPr>
-                <w:color w:val="2563eb"/>
-                <w:sz w:val="18"/>
-                <w:szCs w:val="18"/>
-              </w:rPr>
-              <w:t xml:space="preserve">  ▸  </w:t>
-            </w:r>
-            <w:r>
-              <w:rPr>
-                <w:rFonts w:ascii="Calibri" w:cs="Calibri" w:eastAsia="Calibri" w:hAnsi="Calibri"/>
-                <w:b/>
-                <w:bCs/>
-                <w:color w:val="111827"/>
-                <w:sz w:val="18"/>
-                <w:szCs w:val="18"/>
-              </w:rPr>
-              <w:t xml:space="preserve">MCP Server (Hub)</w:t>
-            </w:r>
-            <w:r>
-              <w:rPr>
-                <w:rFonts w:ascii="Calibri" w:cs="Calibri" w:eastAsia="Calibri" w:hAnsi="Calibri"/>
-                <w:color w:val="6B7280"/>
-                <w:sz w:val="16"/>
-                <w:szCs w:val="16"/>
-              </w:rPr>
-              <w:t xml:space="preserve">  Port 3000 — Core application</w:t>
-            </w:r>
-          </w:p>
-          <w:p>
-            <w:pPr>
-              <w:spacing w:after="20"/>
-            </w:pPr>
-            <w:r>
-              <w:rPr>
-                <w:color w:val="2563eb"/>
-                <w:sz w:val="18"/>
-                <w:szCs w:val="18"/>
-              </w:rPr>
-              <w:t xml:space="preserve">  ▸  </w:t>
-            </w:r>
-            <w:r>
-              <w:rPr>
-                <w:rFonts w:ascii="Calibri" w:cs="Calibri" w:eastAsia="Calibri" w:hAnsi="Calibri"/>
-                <w:color w:val="111827"/>
-                <w:sz w:val="18"/>
-                <w:szCs w:val="18"/>
-              </w:rPr>
-              <w:t xml:space="preserve">Dashboard &amp; AI Chat</w:t>
-            </w:r>
-            <w:r>
-              <w:rPr>
-                <w:rFonts w:ascii="Calibri" w:cs="Calibri" w:eastAsia="Calibri" w:hAnsi="Calibri"/>
-                <w:color w:val="6B7280"/>
-                <w:sz w:val="16"/>
-                <w:szCs w:val="16"/>
-              </w:rPr>
-              <w:t xml:space="preserve">  Unified management UI</w:t>
-            </w:r>
-          </w:p>
-          <w:p>
-            <w:pPr>
-              <w:spacing w:after="20"/>
-            </w:pPr>
-            <w:r>
-              <w:rPr>
-                <w:color w:val="2563eb"/>
-                <w:sz w:val="18"/>
-                <w:szCs w:val="18"/>
-              </w:rPr>
-              <w:t xml:space="preserve">  ▸  </w:t>
-            </w:r>
-            <w:r>
-              <w:rPr>
-                <w:rFonts w:ascii="Calibri" w:cs="Calibri" w:eastAsia="Calibri" w:hAnsi="Calibri"/>
-                <w:color w:val="111827"/>
-                <w:sz w:val="18"/>
-                <w:szCs w:val="18"/>
-              </w:rPr>
-              <w:t xml:space="preserve">Multi-Cluster Hub</w:t>
-            </w:r>
-            <w:r>
-              <w:rPr>
-                <w:rFonts w:ascii="Calibri" w:cs="Calibri" w:eastAsia="Calibri" w:hAnsi="Calibri"/>
-                <w:color w:val="6B7280"/>
-                <w:sz w:val="16"/>
-                <w:szCs w:val="16"/>
-              </w:rPr>
-              <w:t xml:space="preserve">  Agent registry &amp; cluster aggregation</w:t>
-            </w:r>
-          </w:p>
-          <w:p>
-            <w:pPr>
-              <w:spacing w:after="20"/>
-            </w:pPr>
-            <w:r>
-              <w:rPr>
-                <w:color w:val="2563eb"/>
-                <w:sz w:val="18"/>
-                <w:szCs w:val="18"/>
-              </w:rPr>
-              <w:t xml:space="preserve">  ▸  </w:t>
-            </w:r>
-            <w:r>
-              <w:rPr>
-                <w:rFonts w:ascii="Calibri" w:cs="Calibri" w:eastAsia="Calibri" w:hAnsi="Calibri"/>
-                <w:color w:val="111827"/>
-                <w:sz w:val="18"/>
-                <w:szCs w:val="18"/>
-              </w:rPr>
-              <w:t xml:space="preserve">Deploy Orchestrator</w:t>
-            </w:r>
-            <w:r>
-              <w:rPr>
-                <w:rFonts w:ascii="Calibri" w:cs="Calibri" w:eastAsia="Calibri" w:hAnsi="Calibri"/>
-                <w:color w:val="6B7280"/>
-                <w:sz w:val="16"/>
-                <w:szCs w:val="16"/>
-              </w:rPr>
-              <w:t xml:space="preserve">  Document-driven deployment engine</w:t>
-            </w:r>
-          </w:p>
-          <w:p>
-            <w:pPr>
-              <w:spacing w:after="20"/>
-            </w:pPr>
-            <w:r>
-              <w:rPr>
-                <w:color w:val="2563eb"/>
-                <w:sz w:val="18"/>
-                <w:szCs w:val="18"/>
-              </w:rPr>
-              <w:t xml:space="preserve">  ▸  </w:t>
-            </w:r>
-            <w:r>
-              <w:rPr>
-                <w:rFonts w:ascii="Calibri" w:cs="Calibri" w:eastAsia="Calibri" w:hAnsi="Calibri"/>
-                <w:color w:val="111827"/>
-                <w:sz w:val="18"/>
-                <w:szCs w:val="18"/>
-              </w:rPr>
-              <w:t xml:space="preserve">PostgreSQL</w:t>
-            </w:r>
-            <w:r>
-              <w:rPr>
-                <w:rFonts w:ascii="Calibri" w:cs="Calibri" w:eastAsia="Calibri" w:hAnsi="Calibri"/>
-                <w:color w:val="6B7280"/>
-                <w:sz w:val="16"/>
-                <w:szCs w:val="16"/>
-              </w:rPr>
-              <w:t xml:space="preserve">  Port 5432 — Chat history, audit log (optional)</w:t>
-            </w:r>
-          </w:p>
-          <w:p>
-            <w:pPr>
-              <w:spacing w:after="20"/>
-            </w:pPr>
-            <w:r>
-              <w:rPr>
-                <w:color w:val="2563eb"/>
-                <w:sz w:val="18"/>
-                <w:szCs w:val="18"/>
-              </w:rPr>
-              <w:t xml:space="preserve">  ▸  </w:t>
-            </w:r>
-            <w:r>
-              <w:rPr>
-                <w:rFonts w:ascii="Calibri" w:cs="Calibri" w:eastAsia="Calibri" w:hAnsi="Calibri"/>
-                <w:color w:val="111827"/>
-                <w:sz w:val="18"/>
-                <w:szCs w:val="18"/>
-              </w:rPr>
-              <w:t xml:space="preserve">OpenShift Route</w:t>
-            </w:r>
-            <w:r>
-              <w:rPr>
-                <w:rFonts w:ascii="Calibri" w:cs="Calibri" w:eastAsia="Calibri" w:hAnsi="Calibri"/>
-                <w:color w:val="6B7280"/>
-                <w:sz w:val="16"/>
-                <w:szCs w:val="16"/>
-              </w:rPr>
-              <w:t xml:space="preserve">  HTTPS :443 → :3000 (TLS edge, 600s timeout)</w:t>
-            </w:r>
-          </w:p>
-        </w:tc>
-      </w:tr>
-    </w:tbl>
     <w:p>
       <w:pPr>
-        <w:spacing w:after="80" w:before="0"/>
+        <w:spacing w:after="120"/>
+        <w:jc w:val="center"/>
+      </w:pPr>
+      <w:r>
+        <w:drawing>
+          <wp:inline distT="0" distB="0" distL="0" distR="0">
+            <wp:extent cx="6858000" cy="5381625"/>
+            <wp:effectExtent t="0" r="0" b="0" l="0"/>
+            <wp:docPr id="1" name="" descr="" title=""/>
+            <wp:cNvGraphicFramePr>
+              <a:graphicFrameLocks xmlns:a="http://schemas.openxmlformats.org/drawingml/2006/main" noChangeAspect="1"/>
+            </wp:cNvGraphicFramePr>
+            <a:graphic xmlns:a="http://schemas.openxmlformats.org/drawingml/2006/main">
+              <a:graphicData uri="http://schemas.openxmlformats.org/drawingml/2006/picture">
+                <pic:pic xmlns:pic="http://schemas.openxmlformats.org/drawingml/2006/picture">
+                  <pic:nvPicPr>
+                    <pic:cNvPr id="0" name="" descr=""/>
+                    <pic:cNvPicPr>
+                      <a:picLocks noChangeAspect="1" noChangeArrowheads="1"/>
+                    </pic:cNvPicPr>
+                  </pic:nvPicPr>
+                  <pic:blipFill>
+                    <a:blip r:embed="rId7" cstate="none"/>
+                    <a:srcRect/>
+                    <a:stretch>
+                      <a:fillRect/>
+                    </a:stretch>
+                  </pic:blipFill>
+                  <pic:spPr bwMode="auto">
+                    <a:xfrm>
+                      <a:off x="0" y="0"/>
+                      <a:ext cx="6858000" cy="5381625"/>
+                    </a:xfrm>
+                    <a:prstGeom prst="rect">
+                      <a:avLst/>
+                    </a:prstGeom>
+                  </pic:spPr>
+                </pic:pic>
+              </a:graphicData>
+            </a:graphic>
+          </wp:inline>
+        </w:drawing>
+      </w:r>
+    </w:p>
+    <w:p>
+      <w:pPr>
+        <w:spacing w:after="200" w:before="0"/>
+        <w:jc w:val="center"/>
       </w:pPr>
       <w:r>
         <w:rPr>
           <w:rFonts w:ascii="Calibri" w:cs="Calibri" w:eastAsia="Calibri" w:hAnsi="Calibri"/>
+          <w:i/>
+          <w:iCs/>
+          <w:color w:val="6B7280"/>
           <w:sz w:val="22"/>
           <w:szCs w:val="22"/>
         </w:rPr>
-        <w:t xml:space="preserve"/>
+        <w:t xml:space="preserve">Figure 1: Hub-and-Spoke Multi-Cluster Architecture — SNO Hub + 3-Node Agent Cluster</w:t>
       </w:r>
     </w:p>
-    <w:tbl>
-      <w:tblPr>
-        <w:tblW w:type="pct" w:w="100%"/>
-        <w:tblBorders>
-          <w:top w:val="single" w:color="auto" w:sz="4"/>
-          <w:left w:val="single" w:color="auto" w:sz="4"/>
-          <w:bottom w:val="single" w:color="auto" w:sz="4"/>
-          <w:right w:val="single" w:color="auto" w:sz="4"/>
-          <w:insideH w:val="single" w:color="auto" w:sz="4"/>
-          <w:insideV w:val="single" w:color="auto" w:sz="4"/>
-        </w:tblBorders>
-      </w:tblPr>
-      <w:tblGrid>
-        <w:gridCol w:w="100"/>
-      </w:tblGrid>
-      <w:tr>
-        <w:tc>
-          <w:tcPr>
-            <w:tcBorders>
-              <w:top w:val="none" w:color="FFFFFF" w:sz="0"/>
-              <w:left w:val="none" w:color="FFFFFF" w:sz="0"/>
-              <w:bottom w:val="none" w:color="FFFFFF" w:sz="0"/>
-              <w:right w:val="none" w:color="FFFFFF" w:sz="0"/>
-            </w:tcBorders>
-            <w:shd w:fill="0F1B2D" w:val="clear"/>
-            <w:tcMar>
-              <w:top w:type="dxa" w:w="80"/>
-              <w:left w:type="dxa" w:w="100"/>
-              <w:bottom w:type="dxa" w:w="80"/>
-              <w:right w:type="dxa" w:w="100"/>
-            </w:tcMar>
-          </w:tcPr>
-          <w:p>
-            <w:pPr>
-              <w:spacing w:after="0"/>
-              <w:jc w:val="center"/>
-            </w:pPr>
-            <w:r>
-              <w:rPr>
-                <w:b/>
-                <w:bCs/>
-                <w:color w:val="FFFFFF"/>
-                <w:sz w:val="22"/>
-                <w:szCs w:val="22"/>
-              </w:rPr>
-              <w:t xml:space="preserve">COMMUNICATION FLOWS</w:t>
-            </w:r>
-          </w:p>
-        </w:tc>
-      </w:tr>
-    </w:tbl>
-    <w:p>
-      <w:pPr>
-        <w:spacing w:after="80" w:before="0"/>
-      </w:pPr>
-      <w:r>
-        <w:rPr>
-          <w:rFonts w:ascii="Calibri" w:cs="Calibri" w:eastAsia="Calibri" w:hAnsi="Calibri"/>
-          <w:sz w:val="22"/>
-          <w:szCs w:val="22"/>
-        </w:rPr>
-        <w:t xml:space="preserve"/>
-      </w:r>
-    </w:p>
-    <w:tbl>
-      <w:tblPr>
-        <w:tblW w:type="pct" w:w="100%"/>
-        <w:tblBorders>
-          <w:top w:val="single" w:color="auto" w:sz="4"/>
-          <w:left w:val="single" w:color="auto" w:sz="4"/>
-          <w:bottom w:val="single" w:color="auto" w:sz="4"/>
-          <w:right w:val="single" w:color="auto" w:sz="4"/>
-          <w:insideH w:val="single" w:color="auto" w:sz="4"/>
-          <w:insideV w:val="single" w:color="auto" w:sz="4"/>
-        </w:tblBorders>
-      </w:tblPr>
-      <w:tblGrid>
-        <w:gridCol w:w="100"/>
-        <w:gridCol w:w="100"/>
-        <w:gridCol w:w="100"/>
-        <w:gridCol w:w="100"/>
-      </w:tblGrid>
-      <w:tr>
-        <w:tc>
-          <w:tcPr>
-            <w:tcW w:type="pct" w:w="22%"/>
-            <w:tcBorders>
-              <w:top w:val="single" w:color="E5E7EB" w:sz="1"/>
-              <w:left w:val="single" w:color="E5E7EB" w:sz="1"/>
-              <w:bottom w:val="single" w:color="E5E7EB" w:sz="1"/>
-              <w:right w:val="single" w:color="E5E7EB" w:sz="1"/>
-            </w:tcBorders>
-            <w:shd w:fill="D1FAE5" w:val="clear"/>
-            <w:tcMar>
-              <w:top w:type="dxa" w:w="60"/>
-              <w:left w:type="dxa" w:w="100"/>
-              <w:bottom w:type="dxa" w:w="60"/>
-              <w:right w:type="dxa" w:w="100"/>
-            </w:tcMar>
-            <w:vAlign w:val="center"/>
-          </w:tcPr>
-          <w:p>
-            <w:pPr>
-              <w:spacing w:after="0" w:before="0"/>
-              <w:jc w:val="center"/>
-            </w:pPr>
-            <w:r>
-              <w:rPr>
-                <w:rFonts w:ascii="Calibri" w:cs="Calibri" w:eastAsia="Calibri" w:hAnsi="Calibri"/>
-                <w:b/>
-                <w:bCs/>
-                <w:color w:val="111827"/>
-                <w:sz w:val="18"/>
-                <w:szCs w:val="18"/>
-              </w:rPr>
-              <w:t xml:space="preserve">Agent Pod</w:t>
-            </w:r>
-          </w:p>
-        </w:tc>
-        <w:tc>
-          <w:tcPr>
-            <w:tcW w:type="pct" w:w="20%"/>
-            <w:tcBorders>
-              <w:top w:val="single" w:color="E5E7EB" w:sz="1"/>
-              <w:left w:val="single" w:color="E5E7EB" w:sz="1"/>
-              <w:bottom w:val="single" w:color="E5E7EB" w:sz="1"/>
-              <w:right w:val="single" w:color="E5E7EB" w:sz="1"/>
-            </w:tcBorders>
-            <w:shd w:fill="FFFFFF" w:val="clear"/>
-            <w:tcMar>
-              <w:top w:type="dxa" w:w="60"/>
-              <w:left w:type="dxa" w:w="100"/>
-              <w:bottom w:type="dxa" w:w="60"/>
-              <w:right w:type="dxa" w:w="100"/>
-            </w:tcMar>
-            <w:vAlign w:val="center"/>
-          </w:tcPr>
-          <w:p>
-            <w:pPr>
-              <w:spacing w:after="0"/>
-              <w:jc w:val="center"/>
-            </w:pPr>
-            <w:r>
-              <w:rPr>
-                <w:rFonts w:ascii="Calibri" w:cs="Calibri" w:eastAsia="Calibri" w:hAnsi="Calibri"/>
-                <w:b/>
-                <w:bCs/>
-                <w:color w:val="2563eb"/>
-                <w:sz w:val="24"/>
-                <w:szCs w:val="24"/>
-              </w:rPr>
-              <w:t xml:space="preserve">────▶</w:t>
-            </w:r>
-            <w:r>
-              <w:rPr>
-                <w:rFonts w:ascii="Calibri" w:cs="Calibri" w:eastAsia="Calibri" w:hAnsi="Calibri"/>
-                <w:color w:val="6B7280"/>
-                <w:sz w:val="16"/>
-                <w:szCs w:val="16"/>
-              </w:rPr>
-              <w:t xml:space="preserve">
-:3000 HTTP POST</w:t>
-            </w:r>
-          </w:p>
-        </w:tc>
-        <w:tc>
-          <w:tcPr>
-            <w:tcW w:type="pct" w:w="22%"/>
-            <w:tcBorders>
-              <w:top w:val="single" w:color="E5E7EB" w:sz="1"/>
-              <w:left w:val="single" w:color="E5E7EB" w:sz="1"/>
-              <w:bottom w:val="single" w:color="E5E7EB" w:sz="1"/>
-              <w:right w:val="single" w:color="E5E7EB" w:sz="1"/>
-            </w:tcBorders>
-            <w:shd w:fill="DBEAFE" w:val="clear"/>
-            <w:tcMar>
-              <w:top w:type="dxa" w:w="60"/>
-              <w:left w:type="dxa" w:w="100"/>
-              <w:bottom w:type="dxa" w:w="60"/>
-              <w:right w:type="dxa" w:w="100"/>
-            </w:tcMar>
-            <w:vAlign w:val="center"/>
-          </w:tcPr>
-          <w:p>
-            <w:pPr>
-              <w:spacing w:after="0" w:before="0"/>
-              <w:jc w:val="center"/>
-            </w:pPr>
-            <w:r>
-              <w:rPr>
-                <w:rFonts w:ascii="Calibri" w:cs="Calibri" w:eastAsia="Calibri" w:hAnsi="Calibri"/>
-                <w:b/>
-                <w:bCs/>
-                <w:color w:val="111827"/>
-                <w:sz w:val="18"/>
-                <w:szCs w:val="18"/>
-              </w:rPr>
-              <w:t xml:space="preserve">MCP Hub</w:t>
-            </w:r>
-          </w:p>
-        </w:tc>
-        <w:tc>
-          <w:tcPr>
-            <w:tcW w:type="pct" w:w="36%"/>
-            <w:tcBorders>
-              <w:top w:val="single" w:color="E5E7EB" w:sz="1"/>
-              <w:left w:val="single" w:color="E5E7EB" w:sz="1"/>
-              <w:bottom w:val="single" w:color="E5E7EB" w:sz="1"/>
-              <w:right w:val="single" w:color="E5E7EB" w:sz="1"/>
-            </w:tcBorders>
-            <w:shd w:fill="FFFFFF" w:val="clear"/>
-            <w:tcMar>
-              <w:top w:type="dxa" w:w="60"/>
-              <w:left w:type="dxa" w:w="100"/>
-              <w:bottom w:type="dxa" w:w="60"/>
-              <w:right w:type="dxa" w:w="100"/>
-            </w:tcMar>
-            <w:vAlign w:val="center"/>
-          </w:tcPr>
-          <w:p>
-            <w:pPr>
-              <w:spacing w:after="0" w:before="0"/>
-              <w:jc w:val="left"/>
-            </w:pPr>
-            <w:r>
-              <w:rPr>
-                <w:rFonts w:ascii="Calibri" w:cs="Calibri" w:eastAsia="Calibri" w:hAnsi="Calibri"/>
-                <w:color w:val="111827"/>
-                <w:sz w:val="18"/>
-                <w:szCs w:val="18"/>
-              </w:rPr>
-              <w:t xml:space="preserve">Agent registration (once) + periodic reports (every 60s)</w:t>
-            </w:r>
-          </w:p>
-        </w:tc>
-      </w:tr>
-    </w:tbl>
-    <w:p>
-      <w:pPr>
-        <w:spacing w:after="80" w:before="0"/>
-      </w:pPr>
-      <w:r>
-        <w:rPr>
-          <w:rFonts w:ascii="Calibri" w:cs="Calibri" w:eastAsia="Calibri" w:hAnsi="Calibri"/>
-          <w:sz w:val="22"/>
-          <w:szCs w:val="22"/>
-        </w:rPr>
-        <w:t xml:space="preserve"/>
-      </w:r>
-    </w:p>
-    <w:tbl>
-      <w:tblPr>
-        <w:tblW w:type="pct" w:w="100%"/>
-        <w:tblBorders>
-          <w:top w:val="single" w:color="auto" w:sz="4"/>
-          <w:left w:val="single" w:color="auto" w:sz="4"/>
-          <w:bottom w:val="single" w:color="auto" w:sz="4"/>
-          <w:right w:val="single" w:color="auto" w:sz="4"/>
-          <w:insideH w:val="single" w:color="auto" w:sz="4"/>
-          <w:insideV w:val="single" w:color="auto" w:sz="4"/>
-        </w:tblBorders>
-      </w:tblPr>
-      <w:tblGrid>
-        <w:gridCol w:w="100"/>
-        <w:gridCol w:w="100"/>
-        <w:gridCol w:w="100"/>
-        <w:gridCol w:w="100"/>
-      </w:tblGrid>
-      <w:tr>
-        <w:tc>
-          <w:tcPr>
-            <w:tcW w:type="pct" w:w="22%"/>
-            <w:tcBorders>
-              <w:top w:val="single" w:color="E5E7EB" w:sz="1"/>
-              <w:left w:val="single" w:color="E5E7EB" w:sz="1"/>
-              <w:bottom w:val="single" w:color="E5E7EB" w:sz="1"/>
-              <w:right w:val="single" w:color="E5E7EB" w:sz="1"/>
-            </w:tcBorders>
-            <w:shd w:fill="DBEAFE" w:val="clear"/>
-            <w:tcMar>
-              <w:top w:type="dxa" w:w="60"/>
-              <w:left w:type="dxa" w:w="100"/>
-              <w:bottom w:type="dxa" w:w="60"/>
-              <w:right w:type="dxa" w:w="100"/>
-            </w:tcMar>
-            <w:vAlign w:val="center"/>
-          </w:tcPr>
-          <w:p>
-            <w:pPr>
-              <w:spacing w:after="0" w:before="0"/>
-              <w:jc w:val="center"/>
-            </w:pPr>
-            <w:r>
-              <w:rPr>
-                <w:rFonts w:ascii="Calibri" w:cs="Calibri" w:eastAsia="Calibri" w:hAnsi="Calibri"/>
-                <w:b/>
-                <w:bCs/>
-                <w:color w:val="111827"/>
-                <w:sz w:val="18"/>
-                <w:szCs w:val="18"/>
-              </w:rPr>
-              <w:t xml:space="preserve">MCP Hub</w:t>
-            </w:r>
-          </w:p>
-        </w:tc>
-        <w:tc>
-          <w:tcPr>
-            <w:tcW w:type="pct" w:w="20%"/>
-            <w:tcBorders>
-              <w:top w:val="single" w:color="E5E7EB" w:sz="1"/>
-              <w:left w:val="single" w:color="E5E7EB" w:sz="1"/>
-              <w:bottom w:val="single" w:color="E5E7EB" w:sz="1"/>
-              <w:right w:val="single" w:color="E5E7EB" w:sz="1"/>
-            </w:tcBorders>
-            <w:shd w:fill="FFFFFF" w:val="clear"/>
-            <w:tcMar>
-              <w:top w:type="dxa" w:w="60"/>
-              <w:left w:type="dxa" w:w="100"/>
-              <w:bottom w:type="dxa" w:w="60"/>
-              <w:right w:type="dxa" w:w="100"/>
-            </w:tcMar>
-            <w:vAlign w:val="center"/>
-          </w:tcPr>
-          <w:p>
-            <w:pPr>
-              <w:spacing w:after="0"/>
-              <w:jc w:val="center"/>
-            </w:pPr>
-            <w:r>
-              <w:rPr>
-                <w:rFonts w:ascii="Calibri" w:cs="Calibri" w:eastAsia="Calibri" w:hAnsi="Calibri"/>
-                <w:b/>
-                <w:bCs/>
-                <w:color w:val="C2410C"/>
-                <w:sz w:val="24"/>
-                <w:szCs w:val="24"/>
-              </w:rPr>
-              <w:t xml:space="preserve">────▶</w:t>
-            </w:r>
-            <w:r>
-              <w:rPr>
-                <w:rFonts w:ascii="Calibri" w:cs="Calibri" w:eastAsia="Calibri" w:hAnsi="Calibri"/>
-                <w:color w:val="6B7280"/>
-                <w:sz w:val="16"/>
-                <w:szCs w:val="16"/>
-              </w:rPr>
-              <w:t xml:space="preserve">
-:6443 HTTPS GET</w:t>
-            </w:r>
-          </w:p>
-        </w:tc>
-        <w:tc>
-          <w:tcPr>
-            <w:tcW w:type="pct" w:w="22%"/>
-            <w:tcBorders>
-              <w:top w:val="single" w:color="E5E7EB" w:sz="1"/>
-              <w:left w:val="single" w:color="E5E7EB" w:sz="1"/>
-              <w:bottom w:val="single" w:color="E5E7EB" w:sz="1"/>
-              <w:right w:val="single" w:color="E5E7EB" w:sz="1"/>
-            </w:tcBorders>
-            <w:shd w:fill="FED7AA" w:val="clear"/>
-            <w:tcMar>
-              <w:top w:type="dxa" w:w="60"/>
-              <w:left w:type="dxa" w:w="100"/>
-              <w:bottom w:type="dxa" w:w="60"/>
-              <w:right w:type="dxa" w:w="100"/>
-            </w:tcMar>
-            <w:vAlign w:val="center"/>
-          </w:tcPr>
-          <w:p>
-            <w:pPr>
-              <w:spacing w:after="0" w:before="0"/>
-              <w:jc w:val="center"/>
-            </w:pPr>
-            <w:r>
-              <w:rPr>
-                <w:rFonts w:ascii="Calibri" w:cs="Calibri" w:eastAsia="Calibri" w:hAnsi="Calibri"/>
-                <w:b/>
-                <w:bCs/>
-                <w:color w:val="111827"/>
-                <w:sz w:val="18"/>
-                <w:szCs w:val="18"/>
-              </w:rPr>
-              <w:t xml:space="preserve">K8s API</w:t>
-            </w:r>
-          </w:p>
-        </w:tc>
-        <w:tc>
-          <w:tcPr>
-            <w:tcW w:type="pct" w:w="36%"/>
-            <w:tcBorders>
-              <w:top w:val="single" w:color="E5E7EB" w:sz="1"/>
-              <w:left w:val="single" w:color="E5E7EB" w:sz="1"/>
-              <w:bottom w:val="single" w:color="E5E7EB" w:sz="1"/>
-              <w:right w:val="single" w:color="E5E7EB" w:sz="1"/>
-            </w:tcBorders>
-            <w:shd w:fill="FFFFFF" w:val="clear"/>
-            <w:tcMar>
-              <w:top w:type="dxa" w:w="60"/>
-              <w:left w:type="dxa" w:w="100"/>
-              <w:bottom w:type="dxa" w:w="60"/>
-              <w:right w:type="dxa" w:w="100"/>
-            </w:tcMar>
-            <w:vAlign w:val="center"/>
-          </w:tcPr>
-          <w:p>
-            <w:pPr>
-              <w:spacing w:after="0" w:before="0"/>
-              <w:jc w:val="left"/>
-            </w:pPr>
-            <w:r>
-              <w:rPr>
-                <w:rFonts w:ascii="Calibri" w:cs="Calibri" w:eastAsia="Calibri" w:hAnsi="Calibri"/>
-                <w:color w:val="111827"/>
-                <w:sz w:val="18"/>
-                <w:szCs w:val="18"/>
-              </w:rPr>
-              <w:t xml:space="preserve">On-demand health probes + remote cluster queries (every 60s)</w:t>
-            </w:r>
-          </w:p>
-        </w:tc>
-      </w:tr>
-    </w:tbl>
-    <w:p>
-      <w:pPr>
-        <w:spacing w:after="80" w:before="0"/>
-      </w:pPr>
-      <w:r>
-        <w:rPr>
-          <w:rFonts w:ascii="Calibri" w:cs="Calibri" w:eastAsia="Calibri" w:hAnsi="Calibri"/>
-          <w:sz w:val="22"/>
-          <w:szCs w:val="22"/>
-        </w:rPr>
-        <w:t xml:space="preserve"/>
-      </w:r>
-    </w:p>
-    <w:tbl>
-      <w:tblPr>
-        <w:tblW w:type="pct" w:w="100%"/>
-        <w:tblBorders>
-          <w:top w:val="single" w:color="auto" w:sz="4"/>
-          <w:left w:val="single" w:color="auto" w:sz="4"/>
-          <w:bottom w:val="single" w:color="auto" w:sz="4"/>
-          <w:right w:val="single" w:color="auto" w:sz="4"/>
-          <w:insideH w:val="single" w:color="auto" w:sz="4"/>
-          <w:insideV w:val="single" w:color="auto" w:sz="4"/>
-        </w:tblBorders>
-      </w:tblPr>
-      <w:tblGrid>
-        <w:gridCol w:w="100"/>
-        <w:gridCol w:w="100"/>
-        <w:gridCol w:w="100"/>
-        <w:gridCol w:w="100"/>
-      </w:tblGrid>
-      <w:tr>
-        <w:tc>
-          <w:tcPr>
-            <w:tcW w:type="pct" w:w="22%"/>
-            <w:tcBorders>
-              <w:top w:val="single" w:color="E5E7EB" w:sz="1"/>
-              <w:left w:val="single" w:color="E5E7EB" w:sz="1"/>
-              <w:bottom w:val="single" w:color="E5E7EB" w:sz="1"/>
-              <w:right w:val="single" w:color="E5E7EB" w:sz="1"/>
-            </w:tcBorders>
-            <w:shd w:fill="FCE7F3" w:val="clear"/>
-            <w:tcMar>
-              <w:top w:type="dxa" w:w="60"/>
-              <w:left w:type="dxa" w:w="100"/>
-              <w:bottom w:type="dxa" w:w="60"/>
-              <w:right w:type="dxa" w:w="100"/>
-            </w:tcMar>
-            <w:vAlign w:val="center"/>
-          </w:tcPr>
-          <w:p>
-            <w:pPr>
-              <w:spacing w:after="0" w:before="0"/>
-              <w:jc w:val="center"/>
-            </w:pPr>
-            <w:r>
-              <w:rPr>
-                <w:rFonts w:ascii="Calibri" w:cs="Calibri" w:eastAsia="Calibri" w:hAnsi="Calibri"/>
-                <w:b/>
-                <w:bCs/>
-                <w:color w:val="111827"/>
-                <w:sz w:val="18"/>
-                <w:szCs w:val="18"/>
-              </w:rPr>
-              <w:t xml:space="preserve">Browser</w:t>
-            </w:r>
-          </w:p>
-        </w:tc>
-        <w:tc>
-          <w:tcPr>
-            <w:tcW w:type="pct" w:w="20%"/>
-            <w:tcBorders>
-              <w:top w:val="single" w:color="E5E7EB" w:sz="1"/>
-              <w:left w:val="single" w:color="E5E7EB" w:sz="1"/>
-              <w:bottom w:val="single" w:color="E5E7EB" w:sz="1"/>
-              <w:right w:val="single" w:color="E5E7EB" w:sz="1"/>
-            </w:tcBorders>
-            <w:shd w:fill="FFFFFF" w:val="clear"/>
-            <w:tcMar>
-              <w:top w:type="dxa" w:w="60"/>
-              <w:left w:type="dxa" w:w="100"/>
-              <w:bottom w:type="dxa" w:w="60"/>
-              <w:right w:type="dxa" w:w="100"/>
-            </w:tcMar>
-            <w:vAlign w:val="center"/>
-          </w:tcPr>
-          <w:p>
-            <w:pPr>
-              <w:spacing w:after="0"/>
-              <w:jc w:val="center"/>
-            </w:pPr>
-            <w:r>
-              <w:rPr>
-                <w:rFonts w:ascii="Calibri" w:cs="Calibri" w:eastAsia="Calibri" w:hAnsi="Calibri"/>
-                <w:b/>
-                <w:bCs/>
-                <w:color w:val="7C3AED"/>
-                <w:sz w:val="24"/>
-                <w:szCs w:val="24"/>
-              </w:rPr>
-              <w:t xml:space="preserve">────▶</w:t>
-            </w:r>
-            <w:r>
-              <w:rPr>
-                <w:rFonts w:ascii="Calibri" w:cs="Calibri" w:eastAsia="Calibri" w:hAnsi="Calibri"/>
-                <w:color w:val="6B7280"/>
-                <w:sz w:val="16"/>
-                <w:szCs w:val="16"/>
-              </w:rPr>
-              <w:t xml:space="preserve">
-:443 HTTPS</w:t>
-            </w:r>
-          </w:p>
-        </w:tc>
-        <w:tc>
-          <w:tcPr>
-            <w:tcW w:type="pct" w:w="22%"/>
-            <w:tcBorders>
-              <w:top w:val="single" w:color="E5E7EB" w:sz="1"/>
-              <w:left w:val="single" w:color="E5E7EB" w:sz="1"/>
-              <w:bottom w:val="single" w:color="E5E7EB" w:sz="1"/>
-              <w:right w:val="single" w:color="E5E7EB" w:sz="1"/>
-            </w:tcBorders>
-            <w:shd w:fill="DBEAFE" w:val="clear"/>
-            <w:tcMar>
-              <w:top w:type="dxa" w:w="60"/>
-              <w:left w:type="dxa" w:w="100"/>
-              <w:bottom w:type="dxa" w:w="60"/>
-              <w:right w:type="dxa" w:w="100"/>
-            </w:tcMar>
-            <w:vAlign w:val="center"/>
-          </w:tcPr>
-          <w:p>
-            <w:pPr>
-              <w:spacing w:after="0" w:before="0"/>
-              <w:jc w:val="center"/>
-            </w:pPr>
-            <w:r>
-              <w:rPr>
-                <w:rFonts w:ascii="Calibri" w:cs="Calibri" w:eastAsia="Calibri" w:hAnsi="Calibri"/>
-                <w:b/>
-                <w:bCs/>
-                <w:color w:val="111827"/>
-                <w:sz w:val="18"/>
-                <w:szCs w:val="18"/>
-              </w:rPr>
-              <w:t xml:space="preserve">OCP Route</w:t>
-            </w:r>
-          </w:p>
-        </w:tc>
-        <w:tc>
-          <w:tcPr>
-            <w:tcW w:type="pct" w:w="36%"/>
-            <w:tcBorders>
-              <w:top w:val="single" w:color="E5E7EB" w:sz="1"/>
-              <w:left w:val="single" w:color="E5E7EB" w:sz="1"/>
-              <w:bottom w:val="single" w:color="E5E7EB" w:sz="1"/>
-              <w:right w:val="single" w:color="E5E7EB" w:sz="1"/>
-            </w:tcBorders>
-            <w:shd w:fill="FFFFFF" w:val="clear"/>
-            <w:tcMar>
-              <w:top w:type="dxa" w:w="60"/>
-              <w:left w:type="dxa" w:w="100"/>
-              <w:bottom w:type="dxa" w:w="60"/>
-              <w:right w:type="dxa" w:w="100"/>
-            </w:tcMar>
-            <w:vAlign w:val="center"/>
-          </w:tcPr>
-          <w:p>
-            <w:pPr>
-              <w:spacing w:after="0" w:before="0"/>
-              <w:jc w:val="left"/>
-            </w:pPr>
-            <w:r>
-              <w:rPr>
-                <w:rFonts w:ascii="Calibri" w:cs="Calibri" w:eastAsia="Calibri" w:hAnsi="Calibri"/>
-                <w:color w:val="111827"/>
-                <w:sz w:val="18"/>
-                <w:szCs w:val="18"/>
-              </w:rPr>
-              <w:t xml:space="preserve">Dashboard access via OpenShift Route (TLS edge termination)</w:t>
-            </w:r>
-          </w:p>
-        </w:tc>
-      </w:tr>
-    </w:tbl>
-    <w:p>
-      <w:pPr>
-        <w:spacing w:after="80" w:before="0"/>
-      </w:pPr>
-      <w:r>
-        <w:rPr>
-          <w:rFonts w:ascii="Calibri" w:cs="Calibri" w:eastAsia="Calibri" w:hAnsi="Calibri"/>
-          <w:sz w:val="22"/>
-          <w:szCs w:val="22"/>
-        </w:rPr>
-        <w:t xml:space="preserve"/>
-      </w:r>
-    </w:p>
-    <w:tbl>
-      <w:tblPr>
-        <w:tblW w:type="pct" w:w="100%"/>
-        <w:tblBorders>
-          <w:top w:val="single" w:color="auto" w:sz="4"/>
-          <w:left w:val="single" w:color="auto" w:sz="4"/>
-          <w:bottom w:val="single" w:color="auto" w:sz="4"/>
-          <w:right w:val="single" w:color="auto" w:sz="4"/>
-          <w:insideH w:val="single" w:color="auto" w:sz="4"/>
-          <w:insideV w:val="single" w:color="auto" w:sz="4"/>
-        </w:tblBorders>
-      </w:tblPr>
-      <w:tblGrid>
-        <w:gridCol w:w="100"/>
-      </w:tblGrid>
-      <w:tr>
-        <w:tc>
-          <w:tcPr>
-            <w:tcBorders>
-              <w:top w:val="single" w:color="15803d" w:sz="3"/>
-              <w:left w:val="single" w:color="15803d" w:sz="3"/>
-              <w:bottom w:val="single" w:color="15803d" w:sz="3"/>
-              <w:right w:val="single" w:color="15803d" w:sz="3"/>
-            </w:tcBorders>
-            <w:shd w:fill="D1FAE5" w:val="clear"/>
-            <w:tcMar>
-              <w:top w:type="dxa" w:w="120"/>
-              <w:left w:type="dxa" w:w="160"/>
-              <w:bottom w:type="dxa" w:w="120"/>
-              <w:right w:type="dxa" w:w="160"/>
-            </w:tcMar>
-          </w:tcPr>
-          <w:p>
-            <w:pPr>
-              <w:spacing w:after="20"/>
-            </w:pPr>
-            <w:r>
-              <w:rPr>
-                <w:rFonts w:ascii="Calibri" w:cs="Calibri" w:eastAsia="Calibri" w:hAnsi="Calibri"/>
-                <w:b/>
-                <w:bCs/>
-                <w:color w:val="15803d"/>
-                <w:sz w:val="24"/>
-                <w:szCs w:val="24"/>
-              </w:rPr>
-              <w:t xml:space="preserve">☁  3-NODE AGENT CLUSTER</w:t>
-            </w:r>
-          </w:p>
-          <w:p>
-            <w:pPr>
-              <w:spacing w:after="40"/>
-            </w:pPr>
-            <w:r>
-              <w:rPr>
-                <w:rFonts w:ascii="Calibri" w:cs="Calibri" w:eastAsia="Calibri" w:hAnsi="Calibri"/>
-                <w:i/>
-                <w:iCs/>
-                <w:color w:val="6B7280"/>
-                <w:sz w:val="18"/>
-                <w:szCs w:val="18"/>
-              </w:rPr>
-              <w:t xml:space="preserve">10.131.73.21 / .22 / .23 — Namespace: openshift-mcp-agent</w:t>
-            </w:r>
-          </w:p>
-          <w:p>
-            <w:pPr>
-              <w:spacing w:after="20"/>
-            </w:pPr>
-            <w:r>
-              <w:rPr>
-                <w:color w:val="15803d"/>
-                <w:sz w:val="18"/>
-                <w:szCs w:val="18"/>
-              </w:rPr>
-              <w:t xml:space="preserve">  ▸  </w:t>
-            </w:r>
-            <w:r>
-              <w:rPr>
-                <w:rFonts w:ascii="Calibri" w:cs="Calibri" w:eastAsia="Calibri" w:hAnsi="Calibri"/>
-                <w:b/>
-                <w:bCs/>
-                <w:color w:val="111827"/>
-                <w:sz w:val="18"/>
-                <w:szCs w:val="18"/>
-              </w:rPr>
-              <w:t xml:space="preserve">MCP Agent Pod</w:t>
-            </w:r>
-            <w:r>
-              <w:rPr>
-                <w:rFonts w:ascii="Calibri" w:cs="Calibri" w:eastAsia="Calibri" w:hAnsi="Calibri"/>
-                <w:color w:val="6B7280"/>
-                <w:sz w:val="16"/>
-                <w:szCs w:val="16"/>
-              </w:rPr>
-              <w:t xml:space="preserve">  Port 8080 — Scanner + Reporter</w:t>
-            </w:r>
-          </w:p>
-          <w:p>
-            <w:pPr>
-              <w:spacing w:after="20"/>
-            </w:pPr>
-            <w:r>
-              <w:rPr>
-                <w:color w:val="15803d"/>
-                <w:sz w:val="18"/>
-                <w:szCs w:val="18"/>
-              </w:rPr>
-              <w:t xml:space="preserve">  ▸  </w:t>
-            </w:r>
-            <w:r>
-              <w:rPr>
-                <w:rFonts w:ascii="Calibri" w:cs="Calibri" w:eastAsia="Calibri" w:hAnsi="Calibri"/>
-                <w:color w:val="111827"/>
-                <w:sz w:val="18"/>
-                <w:szCs w:val="18"/>
-              </w:rPr>
-              <w:t xml:space="preserve">Scanner</w:t>
-            </w:r>
-            <w:r>
-              <w:rPr>
-                <w:rFonts w:ascii="Calibri" w:cs="Calibri" w:eastAsia="Calibri" w:hAnsi="Calibri"/>
-                <w:color w:val="6B7280"/>
-                <w:sz w:val="16"/>
-                <w:szCs w:val="16"/>
-              </w:rPr>
-              <w:t xml:space="preserve">  Polls local K8s API every 60s (nodes, pods, deployments, events)</w:t>
-            </w:r>
-          </w:p>
-          <w:p>
-            <w:pPr>
-              <w:spacing w:after="20"/>
-            </w:pPr>
-            <w:r>
-              <w:rPr>
-                <w:color w:val="15803d"/>
-                <w:sz w:val="18"/>
-                <w:szCs w:val="18"/>
-              </w:rPr>
-              <w:t xml:space="preserve">  ▸  </w:t>
-            </w:r>
-            <w:r>
-              <w:rPr>
-                <w:rFonts w:ascii="Calibri" w:cs="Calibri" w:eastAsia="Calibri" w:hAnsi="Calibri"/>
-                <w:color w:val="111827"/>
-                <w:sz w:val="18"/>
-                <w:szCs w:val="18"/>
-              </w:rPr>
-              <w:t xml:space="preserve">Reporter</w:t>
-            </w:r>
-            <w:r>
-              <w:rPr>
-                <w:rFonts w:ascii="Calibri" w:cs="Calibri" w:eastAsia="Calibri" w:hAnsi="Calibri"/>
-                <w:color w:val="6B7280"/>
-                <w:sz w:val="16"/>
-                <w:szCs w:val="16"/>
-              </w:rPr>
-              <w:t xml:space="preserve">  Pushes JSON report to Hub via HTTP POST</w:t>
-            </w:r>
-          </w:p>
-          <w:p>
-            <w:pPr>
-              <w:spacing w:after="20"/>
-            </w:pPr>
-            <w:r>
-              <w:rPr>
-                <w:color w:val="15803d"/>
-                <w:sz w:val="18"/>
-                <w:szCs w:val="18"/>
-              </w:rPr>
-              <w:t xml:space="preserve">  ▸  </w:t>
-            </w:r>
-            <w:r>
-              <w:rPr>
-                <w:rFonts w:ascii="Calibri" w:cs="Calibri" w:eastAsia="Calibri" w:hAnsi="Calibri"/>
-                <w:color w:val="111827"/>
-                <w:sz w:val="18"/>
-                <w:szCs w:val="18"/>
-              </w:rPr>
-              <w:t xml:space="preserve">Health Endpoints</w:t>
-            </w:r>
-            <w:r>
-              <w:rPr>
-                <w:rFonts w:ascii="Calibri" w:cs="Calibri" w:eastAsia="Calibri" w:hAnsi="Calibri"/>
-                <w:color w:val="6B7280"/>
-                <w:sz w:val="16"/>
-                <w:szCs w:val="16"/>
-              </w:rPr>
-              <w:t xml:space="preserve">  /healthz, /readyz, /status, /scan</w:t>
-            </w:r>
-          </w:p>
-          <w:p>
-            <w:pPr>
-              <w:spacing w:after="20"/>
-            </w:pPr>
-            <w:r>
-              <w:rPr>
-                <w:color w:val="15803d"/>
-                <w:sz w:val="18"/>
-                <w:szCs w:val="18"/>
-              </w:rPr>
-              <w:t xml:space="preserve">  ▸  </w:t>
-            </w:r>
-            <w:r>
-              <w:rPr>
-                <w:rFonts w:ascii="Calibri" w:cs="Calibri" w:eastAsia="Calibri" w:hAnsi="Calibri"/>
-                <w:color w:val="111827"/>
-                <w:sz w:val="18"/>
-                <w:szCs w:val="18"/>
-              </w:rPr>
-              <w:t xml:space="preserve">Kubernetes API</w:t>
-            </w:r>
-            <w:r>
-              <w:rPr>
-                <w:rFonts w:ascii="Calibri" w:cs="Calibri" w:eastAsia="Calibri" w:hAnsi="Calibri"/>
-                <w:color w:val="6B7280"/>
-                <w:sz w:val="16"/>
-                <w:szCs w:val="16"/>
-              </w:rPr>
-              <w:t xml:space="preserve">  Port 6443 — Master node 10.131.73.21</w:t>
-            </w:r>
-          </w:p>
-          <w:p>
-            <w:pPr>
-              <w:spacing w:after="20"/>
-            </w:pPr>
-            <w:r>
-              <w:rPr>
-                <w:color w:val="15803d"/>
-                <w:sz w:val="18"/>
-                <w:szCs w:val="18"/>
-              </w:rPr>
-              <w:t xml:space="preserve">  ▸  </w:t>
-            </w:r>
-            <w:r>
-              <w:rPr>
-                <w:rFonts w:ascii="Calibri" w:cs="Calibri" w:eastAsia="Calibri" w:hAnsi="Calibri"/>
-                <w:color w:val="111827"/>
-                <w:sz w:val="18"/>
-                <w:szCs w:val="18"/>
-              </w:rPr>
-              <w:t xml:space="preserve">Nodes</w:t>
-            </w:r>
-            <w:r>
-              <w:rPr>
-                <w:rFonts w:ascii="Calibri" w:cs="Calibri" w:eastAsia="Calibri" w:hAnsi="Calibri"/>
-                <w:color w:val="6B7280"/>
-                <w:sz w:val="16"/>
-                <w:szCs w:val="16"/>
-              </w:rPr>
-              <w:t xml:space="preserve">  Master: 10.131.73.21 | Worker1: .22 | Worker2: .23</w:t>
-            </w:r>
-          </w:p>
-        </w:tc>
-      </w:tr>
-    </w:tbl>
     <w:p>
       <w:r>
         <w:br w:type="page"/>

</xml_diff>

<commit_message>
docs: enterprise-grade architecture diagram with OpenShift logos and network icons
Redesign the architecture diagram to industry standard with:
- Red Hat OpenShift logos on both cluster zone headers
- Firewall/shield icon on the network boundary separating clusters
- Server rack icons for components, database cylinder for PostgreSQL
- Route lock icon, globe for browser, cloud for Azure OpenAI
- Kubernetes wheel icon for K8s API
- Red Hat color branding (red accent bars, zone headers)
- Dot grid background, protocol badges on arrows
- Required Firewall Ports callout box in legend
- Node boxes with RHCOS labels and role descriptions

https://claude.ai/code/session_01F4JExjQdDmtQgo57VcSgGB
</commit_message>
<xml_diff>
--- a/docs/TCS-KubeNexus-AI-Multi-Cluster-Network-Architecture.docx
+++ b/docs/TCS-KubeNexus-AI-Multi-Cluster-Network-Architecture.docx
@@ -1921,7 +1921,7 @@
       <w:r>
         <w:drawing>
           <wp:inline distT="0" distB="0" distL="0" distR="0">
-            <wp:extent cx="6858000" cy="5381625"/>
+            <wp:extent cx="7048500" cy="5286375"/>
             <wp:effectExtent t="0" r="0" b="0" l="0"/>
             <wp:docPr id="1" name="" descr="" title=""/>
             <wp:cNvGraphicFramePr>
@@ -1946,7 +1946,7 @@
                   <pic:spPr bwMode="auto">
                     <a:xfrm>
                       <a:off x="0" y="0"/>
-                      <a:ext cx="6858000" cy="5381625"/>
+                      <a:ext cx="7048500" cy="5286375"/>
                     </a:xfrm>
                     <a:prstGeom prst="rect">
                       <a:avLst/>

</xml_diff>